<commit_message>
style: sans-serif contract typography with title rule
Malgun Gothic everywhere (the previous Noto Sans CJK KR name is rarely
installed, so Word fell back to serif Batang), 1.3 line spacing with
justified body, an ink-navy rule under the letter-spaced title, and
centered date lines. Templates regenerated.

Co-Authored-By: Claude Fable 5 <noreply@anthropic.com>
</commit_message>
<xml_diff>
--- a/assets/blueclaw-workspace/skills/paperwork/assets/templates/employment-contract.docx
+++ b/assets/blueclaw-workspace/skills/paperwork/assets/templates/employment-contract.docx
@@ -6,6 +6,9 @@
       <w:pPr>
         <w:spacing w:after="360"/>
         <w:jc w:val="center"/>
+        <w:pBdr>
+          <w:bottom w:val="single" w:sz="12" w:space="8" w:color="1C2430"/>
+        </w:pBdr>
       </w:pPr>
       <w:r>
         <w:rPr>
@@ -241,6 +244,9 @@
     </w:p>
     <w:p/>
     <w:p>
+      <w:pPr>
+        <w:jc w:val="center"/>
+      </w:pPr>
       <w:r>
         <w:t>{{ contractDate }}</w:t>
       </w:r>
@@ -264,6 +270,7 @@
           <w:p>
             <w:pPr>
               <w:spacing w:after="40"/>
+              <w:jc w:val="left"/>
             </w:pPr>
             <w:r/>
             <w:r>
@@ -276,6 +283,7 @@
           <w:p>
             <w:pPr>
               <w:spacing w:after="40"/>
+              <w:jc w:val="left"/>
             </w:pPr>
             <w:r>
               <w:t>사업체명: {{ companyName }} (전화: {{ companyPhone }})</w:t>
@@ -284,6 +292,7 @@
           <w:p>
             <w:pPr>
               <w:spacing w:after="40"/>
+              <w:jc w:val="left"/>
             </w:pPr>
             <w:r>
               <w:t>주소: {{ companyAddress }}</w:t>
@@ -292,6 +301,7 @@
           <w:p>
             <w:pPr>
               <w:spacing w:after="40"/>
+              <w:jc w:val="left"/>
             </w:pPr>
             <w:r>
               <w:t>대표자: {{ representative }} (서명)</w:t>
@@ -305,6 +315,7 @@
           <w:p>
             <w:pPr>
               <w:spacing w:after="40"/>
+              <w:jc w:val="left"/>
             </w:pPr>
             <w:r/>
             <w:r>
@@ -317,6 +328,7 @@
           <w:p>
             <w:pPr>
               <w:spacing w:after="40"/>
+              <w:jc w:val="left"/>
             </w:pPr>
             <w:r>
               <w:t>주소: {{ employeeAddress }}</w:t>
@@ -325,6 +337,7 @@
           <w:p>
             <w:pPr>
               <w:spacing w:after="40"/>
+              <w:jc w:val="left"/>
             </w:pPr>
             <w:r>
               <w:t>연락처: {{ employeePhone }}</w:t>
@@ -333,6 +346,7 @@
           <w:p>
             <w:pPr>
               <w:spacing w:after="40"/>
+              <w:jc w:val="left"/>
             </w:pPr>
             <w:r>
               <w:t>성명: {{ employeeName }} (서명)</w:t>
@@ -715,10 +729,11 @@
     <w:qFormat/>
     <w:rsid w:val="00FC693F"/>
     <w:pPr>
-      <w:spacing w:after="80" w:line="300" w:lineRule="auto"/>
+      <w:spacing w:after="80" w:line="312" w:lineRule="auto"/>
+      <w:jc w:val="both"/>
     </w:pPr>
     <w:rPr>
-      <w:rFonts w:ascii="Noto Sans CJK KR" w:hAnsi="Noto Sans CJK KR" w:eastAsia="Noto Sans CJK KR"/>
+      <w:rFonts w:ascii="맑은 고딕" w:hAnsi="맑은 고딕" w:eastAsia="맑은 고딕"/>
       <w:color w:val="1C2430"/>
       <w:sz w:val="21"/>
     </w:rPr>

</xml_diff>